<commit_message>
Add the correction ladder and retrain on the filtered inventory
Retraining on the melt-out-filtered inventory, with release points derived as the centroid of
release-angle terrain rather than its highest pixel, gives AUC 0.841 [0.829, 0.853] - down from
0.934. The drop is the result: cleaning the labels removes apparent skill that was never real.

Laid out cumulatively this gives the paper its spine. Published protocol 1.000 -> terrain-matched
background 0.954 -> spatial-block CV 0.939 -> drop our own TPI artefact 0.934 -> filtered labels and
unbiased release points 0.841. The largest single term is label quality at -0.094, roughly six times
spatial cross-validation at -0.015 - and inventory precision is not reported at all in the studies
reproduced here, so that term is invisible in published work.

The ladder becomes section 4.1 with Table 1 and Figure 1; everything else renumbers after it.

Co-Authored-By: Claude Opus 5 <noreply@anthropic.com>
</commit_message>
<xml_diff>
--- a/Avalanche_Manuscript.docx
+++ b/Avalanche_Manuscript.docx
@@ -315,7 +315,16 @@
         <w:rPr>
           <w:color w:val="0B3D5C"/>
         </w:rPr>
-        <w:t>4.1 Where reported performance comes from</w:t>
+        <w:t>4.1 What each correction costs</w:t>
+      </w:r>
+    </w:p>
+    <w:p>
+      <w:r>
+        <w:rPr>
+          <w:i w:val="0"/>
+          <w:sz w:val="22"/>
+        </w:rPr>
+        <w:t>Five corrections separate the published protocol from a defensible estimate. Applying them cumulatively to the same models and the same study area shows how much of the reported figure each one accounts for.</w:t>
       </w:r>
     </w:p>
     <w:p>
@@ -324,7 +333,454 @@
           <w:b/>
           <w:sz w:val="19"/>
         </w:rPr>
-        <w:t>Table 1. Controlled decomposition of reported performance.</w:t>
+        <w:t>Table 1. Cumulative effect of each methodological correction (XGBoost).</w:t>
+      </w:r>
+    </w:p>
+    <w:tbl>
+      <w:tblPr>
+        <w:tblStyle w:val="LightGrid-Accent1"/>
+        <w:tblW w:type="auto" w:w="0"/>
+        <w:jc w:val="center"/>
+        <w:tblLook w:firstColumn="1" w:firstRow="1" w:lastColumn="0" w:lastRow="0" w:noHBand="0" w:noVBand="1" w:val="04A0"/>
+      </w:tblPr>
+      <w:tblGrid>
+        <w:gridCol w:w="2160"/>
+        <w:gridCol w:w="2160"/>
+        <w:gridCol w:w="2160"/>
+        <w:gridCol w:w="2160"/>
+      </w:tblGrid>
+      <w:tr>
+        <w:tc>
+          <w:tcPr>
+            <w:tcW w:type="dxa" w:w="3600"/>
+          </w:tcPr>
+          <w:p>
+            <w:r/>
+            <w:r>
+              <w:rPr>
+                <w:b/>
+                <w:sz w:val="18"/>
+              </w:rPr>
+              <w:t>Configuration</w:t>
+            </w:r>
+          </w:p>
+        </w:tc>
+        <w:tc>
+          <w:tcPr>
+            <w:tcW w:type="dxa" w:w="1008"/>
+          </w:tcPr>
+          <w:p>
+            <w:r/>
+            <w:r>
+              <w:rPr>
+                <w:b/>
+                <w:sz w:val="18"/>
+              </w:rPr>
+              <w:t>AUC</w:t>
+            </w:r>
+          </w:p>
+        </w:tc>
+        <w:tc>
+          <w:tcPr>
+            <w:tcW w:type="dxa" w:w="864"/>
+          </w:tcPr>
+          <w:p>
+            <w:r/>
+            <w:r>
+              <w:rPr>
+                <w:b/>
+                <w:sz w:val="18"/>
+              </w:rPr>
+              <w:t>Δ</w:t>
+            </w:r>
+          </w:p>
+        </w:tc>
+        <w:tc>
+          <w:tcPr>
+            <w:tcW w:type="dxa" w:w="2880"/>
+          </w:tcPr>
+          <w:p>
+            <w:r/>
+            <w:r>
+              <w:rPr>
+                <w:b/>
+                <w:sz w:val="18"/>
+              </w:rPr>
+              <w:t>What it removes</w:t>
+            </w:r>
+          </w:p>
+        </w:tc>
+      </w:tr>
+      <w:tr>
+        <w:tc>
+          <w:tcPr>
+            <w:tcW w:type="dxa" w:w="3600"/>
+          </w:tcPr>
+          <w:p>
+            <w:r/>
+            <w:r>
+              <w:rPr>
+                <w:sz w:val="18"/>
+              </w:rPr>
+              <w:t>Published protocol (flat/vegetated absences, random CV)</w:t>
+            </w:r>
+          </w:p>
+        </w:tc>
+        <w:tc>
+          <w:tcPr>
+            <w:tcW w:type="dxa" w:w="1008"/>
+          </w:tcPr>
+          <w:p>
+            <w:r/>
+            <w:r>
+              <w:rPr>
+                <w:sz w:val="18"/>
+              </w:rPr>
+              <w:t>1.000</w:t>
+            </w:r>
+          </w:p>
+        </w:tc>
+        <w:tc>
+          <w:tcPr>
+            <w:tcW w:type="dxa" w:w="864"/>
+          </w:tcPr>
+          <w:p>
+            <w:r/>
+            <w:r>
+              <w:rPr>
+                <w:sz w:val="18"/>
+              </w:rPr>
+              <w:t>nan</w:t>
+            </w:r>
+          </w:p>
+        </w:tc>
+        <w:tc>
+          <w:tcPr>
+            <w:tcW w:type="dxa" w:w="2880"/>
+          </w:tcPr>
+          <w:p>
+            <w:r/>
+            <w:r>
+              <w:rPr>
+                <w:sz w:val="18"/>
+              </w:rPr>
+              <w:t>nan</w:t>
+            </w:r>
+          </w:p>
+        </w:tc>
+      </w:tr>
+      <w:tr>
+        <w:tc>
+          <w:tcPr>
+            <w:tcW w:type="dxa" w:w="3600"/>
+          </w:tcPr>
+          <w:p>
+            <w:r/>
+            <w:r>
+              <w:rPr>
+                <w:sz w:val="18"/>
+              </w:rPr>
+              <w:t>terrain-matched background</w:t>
+            </w:r>
+          </w:p>
+        </w:tc>
+        <w:tc>
+          <w:tcPr>
+            <w:tcW w:type="dxa" w:w="1008"/>
+          </w:tcPr>
+          <w:p>
+            <w:r/>
+            <w:r>
+              <w:rPr>
+                <w:sz w:val="18"/>
+              </w:rPr>
+              <w:t>0.954</w:t>
+            </w:r>
+          </w:p>
+        </w:tc>
+        <w:tc>
+          <w:tcPr>
+            <w:tcW w:type="dxa" w:w="864"/>
+          </w:tcPr>
+          <w:p>
+            <w:r/>
+            <w:r>
+              <w:rPr>
+                <w:sz w:val="18"/>
+              </w:rPr>
+              <w:t>-0.046</w:t>
+            </w:r>
+          </w:p>
+        </w:tc>
+        <w:tc>
+          <w:tcPr>
+            <w:tcW w:type="dxa" w:w="2880"/>
+          </w:tcPr>
+          <w:p>
+            <w:r/>
+            <w:r>
+              <w:rPr>
+                <w:sz w:val="18"/>
+              </w:rPr>
+              <w:t>removes land-cover separability</w:t>
+            </w:r>
+          </w:p>
+        </w:tc>
+      </w:tr>
+      <w:tr>
+        <w:tc>
+          <w:tcPr>
+            <w:tcW w:type="dxa" w:w="3600"/>
+          </w:tcPr>
+          <w:p>
+            <w:r/>
+            <w:r>
+              <w:rPr>
+                <w:sz w:val="18"/>
+              </w:rPr>
+              <w:t>spatial-block cross-validation</w:t>
+            </w:r>
+          </w:p>
+        </w:tc>
+        <w:tc>
+          <w:tcPr>
+            <w:tcW w:type="dxa" w:w="1008"/>
+          </w:tcPr>
+          <w:p>
+            <w:r/>
+            <w:r>
+              <w:rPr>
+                <w:sz w:val="18"/>
+              </w:rPr>
+              <w:t>0.939</w:t>
+            </w:r>
+          </w:p>
+        </w:tc>
+        <w:tc>
+          <w:tcPr>
+            <w:tcW w:type="dxa" w:w="864"/>
+          </w:tcPr>
+          <w:p>
+            <w:r/>
+            <w:r>
+              <w:rPr>
+                <w:sz w:val="18"/>
+              </w:rPr>
+              <w:t>-0.015</w:t>
+            </w:r>
+          </w:p>
+        </w:tc>
+        <w:tc>
+          <w:tcPr>
+            <w:tcW w:type="dxa" w:w="2880"/>
+          </w:tcPr>
+          <w:p>
+            <w:r/>
+            <w:r>
+              <w:rPr>
+                <w:sz w:val="18"/>
+              </w:rPr>
+              <w:t>removes fold leakage</w:t>
+            </w:r>
+          </w:p>
+        </w:tc>
+      </w:tr>
+      <w:tr>
+        <w:tc>
+          <w:tcPr>
+            <w:tcW w:type="dxa" w:w="3600"/>
+          </w:tcPr>
+          <w:p>
+            <w:r/>
+            <w:r>
+              <w:rPr>
+                <w:sz w:val="18"/>
+              </w:rPr>
+              <w:t>drop self-induced TPI artefact</w:t>
+            </w:r>
+          </w:p>
+        </w:tc>
+        <w:tc>
+          <w:tcPr>
+            <w:tcW w:type="dxa" w:w="1008"/>
+          </w:tcPr>
+          <w:p>
+            <w:r/>
+            <w:r>
+              <w:rPr>
+                <w:sz w:val="18"/>
+              </w:rPr>
+              <w:t>0.934</w:t>
+            </w:r>
+          </w:p>
+        </w:tc>
+        <w:tc>
+          <w:tcPr>
+            <w:tcW w:type="dxa" w:w="864"/>
+          </w:tcPr>
+          <w:p>
+            <w:r/>
+            <w:r>
+              <w:rPr>
+                <w:sz w:val="18"/>
+              </w:rPr>
+              <w:t>-0.005</w:t>
+            </w:r>
+          </w:p>
+        </w:tc>
+        <w:tc>
+          <w:tcPr>
+            <w:tcW w:type="dxa" w:w="2880"/>
+          </w:tcPr>
+          <w:p>
+            <w:r/>
+            <w:r>
+              <w:rPr>
+                <w:sz w:val="18"/>
+              </w:rPr>
+              <w:t>removes our own bias</w:t>
+            </w:r>
+          </w:p>
+        </w:tc>
+      </w:tr>
+      <w:tr>
+        <w:tc>
+          <w:tcPr>
+            <w:tcW w:type="dxa" w:w="3600"/>
+          </w:tcPr>
+          <w:p>
+            <w:r/>
+            <w:r>
+              <w:rPr>
+                <w:sz w:val="18"/>
+              </w:rPr>
+              <w:t>melt-out filter and unbiased release points</w:t>
+            </w:r>
+          </w:p>
+        </w:tc>
+        <w:tc>
+          <w:tcPr>
+            <w:tcW w:type="dxa" w:w="1008"/>
+          </w:tcPr>
+          <w:p>
+            <w:r/>
+            <w:r>
+              <w:rPr>
+                <w:sz w:val="18"/>
+              </w:rPr>
+              <w:t>0.841</w:t>
+            </w:r>
+          </w:p>
+        </w:tc>
+        <w:tc>
+          <w:tcPr>
+            <w:tcW w:type="dxa" w:w="864"/>
+          </w:tcPr>
+          <w:p>
+            <w:r/>
+            <w:r>
+              <w:rPr>
+                <w:sz w:val="18"/>
+              </w:rPr>
+              <w:t>-0.094</w:t>
+            </w:r>
+          </w:p>
+        </w:tc>
+        <w:tc>
+          <w:tcPr>
+            <w:tcW w:type="dxa" w:w="2880"/>
+          </w:tcPr>
+          <w:p>
+            <w:r/>
+            <w:r>
+              <w:rPr>
+                <w:sz w:val="18"/>
+              </w:rPr>
+              <w:t>removes false-positive labels</w:t>
+            </w:r>
+          </w:p>
+        </w:tc>
+      </w:tr>
+    </w:tbl>
+    <w:p/>
+    <w:p>
+      <w:r>
+        <w:rPr>
+          <w:i w:val="0"/>
+          <w:sz w:val="22"/>
+        </w:rPr>
+        <w:t>The conventional protocol returns AUC 1.000 and the fully corrected configuration 0.841, a difference of 0.159. The largest single term is not the one the field has concentrated on. Spatial cross-validation, the standard methodological correction in this literature, accounts for 0.015; label quality — removing melt-out false positives and deriving release points without an extreme-value rule — accounts for 0.094, roughly six times as much. Inventory precision is not reported at all in the studies we reproduce, so this term is invisible in published work.</w:t>
+      </w:r>
+    </w:p>
+    <w:p>
+      <w:pPr>
+        <w:jc w:val="center"/>
+      </w:pPr>
+      <w:r>
+        <w:drawing>
+          <wp:inline xmlns:a="http://schemas.openxmlformats.org/drawingml/2006/main" xmlns:pic="http://schemas.openxmlformats.org/drawingml/2006/picture">
+            <wp:extent cx="5486400" cy="2938613"/>
+            <wp:docPr id="1" name="Picture 1"/>
+            <wp:cNvGraphicFramePr>
+              <a:graphicFrameLocks noChangeAspect="1"/>
+            </wp:cNvGraphicFramePr>
+            <a:graphic>
+              <a:graphicData uri="http://schemas.openxmlformats.org/drawingml/2006/picture">
+                <pic:pic>
+                  <pic:nvPicPr>
+                    <pic:cNvPr id="0" name="fig_correction_ladder.png"/>
+                    <pic:cNvPicPr/>
+                  </pic:nvPicPr>
+                  <pic:blipFill>
+                    <a:blip r:embed="rId9"/>
+                    <a:stretch>
+                      <a:fillRect/>
+                    </a:stretch>
+                  </pic:blipFill>
+                  <pic:spPr>
+                    <a:xfrm>
+                      <a:off x="0" y="0"/>
+                      <a:ext cx="5486400" cy="2938613"/>
+                    </a:xfrm>
+                    <a:prstGeom prst="rect"/>
+                  </pic:spPr>
+                </pic:pic>
+              </a:graphicData>
+            </a:graphic>
+          </wp:inline>
+        </w:drawing>
+      </w:r>
+    </w:p>
+    <w:p>
+      <w:pPr>
+        <w:jc w:val="center"/>
+      </w:pPr>
+      <w:r>
+        <w:rPr>
+          <w:i/>
+          <w:sz w:val="18"/>
+        </w:rPr>
+        <w:t>Figure 1. Cumulative effect of each correction. Label quality removes more apparent skill than sampling design and spatial validation combined.</w:t>
+      </w:r>
+    </w:p>
+    <w:p>
+      <w:pPr>
+        <w:pStyle w:val="Heading2"/>
+      </w:pPr>
+      <w:r>
+        <w:rPr>
+          <w:color w:val="0B3D5C"/>
+        </w:rPr>
+        <w:t>4.2 2</w:t>
+      </w:r>
+    </w:p>
+    <w:p>
+      <w:r>
+        <w:rPr>
+          <w:b/>
+          <w:sz w:val="19"/>
+        </w:rPr>
+        <w:t>Table 2. Controlled decomposition of reported performance.</w:t>
       </w:r>
     </w:p>
     <w:tbl>
@@ -725,7 +1181,7 @@
         <w:drawing>
           <wp:inline xmlns:a="http://schemas.openxmlformats.org/drawingml/2006/main" xmlns:pic="http://schemas.openxmlformats.org/drawingml/2006/picture">
             <wp:extent cx="5486400" cy="3500387"/>
-            <wp:docPr id="1" name="Picture 1"/>
+            <wp:docPr id="2" name="Picture 2"/>
             <wp:cNvGraphicFramePr>
               <a:graphicFrameLocks noChangeAspect="1"/>
             </wp:cNvGraphicFramePr>
@@ -737,7 +1193,7 @@
                     <pic:cNvPicPr/>
                   </pic:nvPicPr>
                   <pic:blipFill>
-                    <a:blip r:embed="rId9"/>
+                    <a:blip r:embed="rId10"/>
                     <a:stretch>
                       <a:fillRect/>
                     </a:stretch>
@@ -765,7 +1221,7 @@
           <w:i/>
           <w:sz w:val="18"/>
         </w:rPr>
-        <w:t>Figure 1. Decomposition of reported performance. Paper-style absences produce perfect separation regardless of the cross-validation scheme.</w:t>
+        <w:t>Figure 2. Decomposition of reported performance. Paper-style absences produce perfect separation regardless of the cross-validation scheme.</w:t>
       </w:r>
     </w:p>
     <w:p>
@@ -783,7 +1239,7 @@
           <w:b/>
           <w:sz w:val="19"/>
         </w:rPr>
-        <w:t>Table 2. Sensitivity of the decomposition to inventory confidence.</w:t>
+        <w:t>Table 3. Sensitivity of the decomposition to inventory confidence.</w:t>
       </w:r>
     </w:p>
     <w:tbl>
@@ -1175,7 +1631,7 @@
         <w:drawing>
           <wp:inline xmlns:a="http://schemas.openxmlformats.org/drawingml/2006/main" xmlns:pic="http://schemas.openxmlformats.org/drawingml/2006/picture">
             <wp:extent cx="5486400" cy="3592718"/>
-            <wp:docPr id="2" name="Picture 2"/>
+            <wp:docPr id="3" name="Picture 3"/>
             <wp:cNvGraphicFramePr>
               <a:graphicFrameLocks noChangeAspect="1"/>
             </wp:cNvGraphicFramePr>
@@ -1187,7 +1643,7 @@
                     <pic:cNvPicPr/>
                   </pic:nvPicPr>
                   <pic:blipFill>
-                    <a:blip r:embed="rId10"/>
+                    <a:blip r:embed="rId11"/>
                     <a:stretch>
                       <a:fillRect/>
                     </a:stretch>
@@ -1215,7 +1671,7 @@
           <w:i/>
           <w:sz w:val="18"/>
         </w:rPr>
-        <w:t>Figure 2. The sampling artefact is independent of inventory size and label confidence.</w:t>
+        <w:t>Figure 3. The sampling artefact is independent of inventory size and label confidence.</w:t>
       </w:r>
     </w:p>
     <w:p>
@@ -1226,7 +1682,7 @@
         <w:rPr>
           <w:color w:val="0B3D5C"/>
         </w:rPr>
-        <w:t>4.2 How many detections are real?</w:t>
+        <w:t>4.3 2</w:t>
       </w:r>
     </w:p>
     <w:p>
@@ -1244,7 +1700,7 @@
           <w:b/>
           <w:sz w:val="19"/>
         </w:rPr>
-        <w:t>Table 8. Blind optical verification of the Sentinel-1 detections.</w:t>
+        <w:t>Table 4. Blind optical verification of the Sentinel-1 detections.</w:t>
       </w:r>
     </w:p>
     <w:tbl>
@@ -1543,7 +1999,7 @@
           <w:b/>
           <w:sz w:val="19"/>
         </w:rPr>
-        <w:t>Table 9. Effect of the snow-persistence filter on the reviewed detections.</w:t>
+        <w:t>Table 5. Effect of the snow-persistence filter on the reviewed detections.</w:t>
       </w:r>
     </w:p>
     <w:tbl>
@@ -1823,7 +2279,7 @@
         <w:rPr>
           <w:color w:val="0B3D5C"/>
         </w:rPr>
-        <w:t>4.3 Model comparison under honest validation</w:t>
+        <w:t>4.4 3</w:t>
       </w:r>
     </w:p>
     <w:p>
@@ -1832,7 +2288,7 @@
           <w:b/>
           <w:sz w:val="19"/>
         </w:rPr>
-        <w:t>Table 3. Model performance with terrain-matched absences (20 predictors, TPI excluded).</w:t>
+        <w:t>Table 6. Model performance with terrain-matched absences (20 predictors, TPI excluded).</w:t>
       </w:r>
     </w:p>
     <w:tbl>
@@ -2391,7 +2847,7 @@
         <w:drawing>
           <wp:inline xmlns:a="http://schemas.openxmlformats.org/drawingml/2006/main" xmlns:pic="http://schemas.openxmlformats.org/drawingml/2006/picture">
             <wp:extent cx="4937760" cy="2758558"/>
-            <wp:docPr id="3" name="Picture 3"/>
+            <wp:docPr id="4" name="Picture 4"/>
             <wp:cNvGraphicFramePr>
               <a:graphicFrameLocks noChangeAspect="1"/>
             </wp:cNvGraphicFramePr>
@@ -2403,7 +2859,7 @@
                     <pic:cNvPicPr/>
                   </pic:nvPicPr>
                   <pic:blipFill>
-                    <a:blip r:embed="rId11"/>
+                    <a:blip r:embed="rId12"/>
                     <a:stretch>
                       <a:fillRect/>
                     </a:stretch>
@@ -2431,7 +2887,7 @@
           <w:i/>
           <w:sz w:val="18"/>
         </w:rPr>
-        <w:t>Figure 3. Model ranking with bootstrap confidence intervals.</w:t>
+        <w:t>Figure 4. Model ranking with bootstrap confidence intervals.</w:t>
       </w:r>
     </w:p>
     <w:p>
@@ -2442,7 +2898,7 @@
         <w:rPr>
           <w:color w:val="0B3D5C"/>
         </w:rPr>
-        <w:t>4.4 Coarse predictors encode geography, not snowpack</w:t>
+        <w:t>4.5 4</w:t>
       </w:r>
     </w:p>
     <w:p>
@@ -2451,7 +2907,7 @@
           <w:b/>
           <w:sz w:val="19"/>
         </w:rPr>
-        <w:t>Table 4. Replacing coarse predictors with raw spatial coordinates.</w:t>
+        <w:t>Table 7. Replacing coarse predictors with raw spatial coordinates.</w:t>
       </w:r>
     </w:p>
     <w:tbl>
@@ -2838,7 +3294,7 @@
         <w:drawing>
           <wp:inline xmlns:a="http://schemas.openxmlformats.org/drawingml/2006/main" xmlns:pic="http://schemas.openxmlformats.org/drawingml/2006/picture">
             <wp:extent cx="5852160" cy="2784168"/>
-            <wp:docPr id="4" name="Picture 4"/>
+            <wp:docPr id="5" name="Picture 5"/>
             <wp:cNvGraphicFramePr>
               <a:graphicFrameLocks noChangeAspect="1"/>
             </wp:cNvGraphicFramePr>
@@ -2850,7 +3306,7 @@
                     <pic:cNvPicPr/>
                   </pic:nvPicPr>
                   <pic:blipFill>
-                    <a:blip r:embed="rId12"/>
+                    <a:blip r:embed="rId13"/>
                     <a:stretch>
                       <a:fillRect/>
                     </a:stretch>
@@ -2878,7 +3334,7 @@
           <w:i/>
           <w:sz w:val="18"/>
         </w:rPr>
-        <w:t>Figure 4. Coarse predictors are interchangeable with coordinates.</w:t>
+        <w:t>Figure 5. Coarse predictors are interchangeable with coordinates.</w:t>
       </w:r>
     </w:p>
     <w:p>
@@ -2889,7 +3345,7 @@
         <w:rPr>
           <w:color w:val="0B3D5C"/>
         </w:rPr>
-        <w:t>4.5 Reported AUC depends on the background sampling ratio</w:t>
+        <w:t>4.6 5</w:t>
       </w:r>
     </w:p>
     <w:p>
@@ -2898,7 +3354,7 @@
           <w:b/>
           <w:sz w:val="19"/>
         </w:rPr>
-        <w:t>Table 5. Effect of the background sampling ratio.</w:t>
+        <w:t>Table 8. Effect of the background sampling ratio.</w:t>
       </w:r>
     </w:p>
     <w:tbl>
@@ -3227,7 +3683,7 @@
         <w:rPr>
           <w:color w:val="0B3D5C"/>
         </w:rPr>
-        <w:t>4.6 Spatial transferability</w:t>
+        <w:t>4.7 6</w:t>
       </w:r>
     </w:p>
     <w:p>
@@ -3236,7 +3692,7 @@
           <w:b/>
           <w:sz w:val="19"/>
         </w:rPr>
-        <w:t>Table 6. Training on one sub-basin and testing on the other.</w:t>
+        <w:t>Table 9. Training on one sub-basin and testing on the other.</w:t>
       </w:r>
     </w:p>
     <w:tbl>
@@ -3449,7 +3905,7 @@
         <w:drawing>
           <wp:inline xmlns:a="http://schemas.openxmlformats.org/drawingml/2006/main" xmlns:pic="http://schemas.openxmlformats.org/drawingml/2006/picture">
             <wp:extent cx="6035040" cy="2366476"/>
-            <wp:docPr id="5" name="Picture 5"/>
+            <wp:docPr id="6" name="Picture 6"/>
             <wp:cNvGraphicFramePr>
               <a:graphicFrameLocks noChangeAspect="1"/>
             </wp:cNvGraphicFramePr>
@@ -3461,7 +3917,7 @@
                     <pic:cNvPicPr/>
                   </pic:nvPicPr>
                   <pic:blipFill>
-                    <a:blip r:embed="rId13"/>
+                    <a:blip r:embed="rId14"/>
                     <a:stretch>
                       <a:fillRect/>
                     </a:stretch>
@@ -3489,7 +3945,7 @@
           <w:i/>
           <w:sz w:val="18"/>
         </w:rPr>
-        <w:t>Figure 5. Sub-basin transferability (left) and SHAP predictor importance (right).</w:t>
+        <w:t>Figure 6. Sub-basin transferability (left) and SHAP predictor importance (right).</w:t>
       </w:r>
     </w:p>
     <w:p>
@@ -3500,7 +3956,7 @@
         <w:rPr>
           <w:color w:val="0B3D5C"/>
         </w:rPr>
-        <w:t>4.7 Calibration</w:t>
+        <w:t>4.8 7</w:t>
       </w:r>
     </w:p>
     <w:p>
@@ -3520,7 +3976,7 @@
         <w:rPr>
           <w:color w:val="0B3D5C"/>
         </w:rPr>
-        <w:t>4.8 Illustrative application: susceptibility map</w:t>
+        <w:t>4.9 8</w:t>
       </w:r>
     </w:p>
     <w:p>
@@ -3547,7 +4003,7 @@
           <w:b/>
           <w:sz w:val="19"/>
         </w:rPr>
-        <w:t>Table 7. Susceptibility classes within potential release areas.</w:t>
+        <w:t>Table 10. Susceptibility classes within potential release areas.</w:t>
       </w:r>
     </w:p>
     <w:tbl>
@@ -3839,7 +4295,7 @@
         <w:drawing>
           <wp:inline xmlns:a="http://schemas.openxmlformats.org/drawingml/2006/main" xmlns:pic="http://schemas.openxmlformats.org/drawingml/2006/picture">
             <wp:extent cx="5852160" cy="5554980"/>
-            <wp:docPr id="6" name="Picture 6"/>
+            <wp:docPr id="7" name="Picture 7"/>
             <wp:cNvGraphicFramePr>
               <a:graphicFrameLocks noChangeAspect="1"/>
             </wp:cNvGraphicFramePr>
@@ -3851,7 +4307,7 @@
                     <pic:cNvPicPr/>
                   </pic:nvPicPr>
                   <pic:blipFill>
-                    <a:blip r:embed="rId14"/>
+                    <a:blip r:embed="rId15"/>
                     <a:stretch>
                       <a:fillRect/>
                     </a:stretch>
@@ -3879,7 +4335,7 @@
           <w:i/>
           <w:sz w:val="18"/>
         </w:rPr>
-        <w:t>Figure 6. Avalanche susceptibility across the Chandra-Bhaga and Upper Beas basins, restricted to potential release areas.</w:t>
+        <w:t>Figure 7. Avalanche susceptibility across the Chandra-Bhaga and Upper Beas basins, restricted to potential release areas.</w:t>
       </w:r>
     </w:p>
     <w:p>

</xml_diff>

<commit_message>
Add a robustness check on the inflation law
The obvious objection to a synthetic result is that it reflects the construction rather than the
problem. The null arm is therefore repeated across six settings - Random Forest and XGBoost, 4, 8
and 20 predictors, and 500, 2,000 and 5,000 samples per class. Null-model AUC differs by at most
0.030 at any displacement and by 0.001 at delta = 6, so the inflation is a property of evaluating a
presence-only model against constructed absences rather than of this simulation.

Empirical cross-hazard replication on landslide inventories remains the strongest next step and is
named as such in the limitations; NASA COOLR's REST services were unreachable from this environment
and no verified Earth Engine asset was found, so it is not attempted here rather than approximated.

Co-Authored-By: Claude Opus 5 <noreply@anthropic.com>
</commit_message>
<xml_diff>
--- a/Avalanche_Manuscript.docx
+++ b/Avalanche_Manuscript.docx
@@ -958,6 +958,749 @@
       </w:r>
     </w:p>
     <w:p>
+      <w:r>
+        <w:rPr>
+          <w:i w:val="0"/>
+          <w:sz w:val="22"/>
+        </w:rPr>
+        <w:t>A synthetic result invites the objection that it reflects the authors' construction rather than the problem, so the null arm was repeated while varying the learner, the number of predictors and the sample size. The inflation is essentially unchanged throughout: across six settings the null-model AUC differs by at most 0.030 at any displacement, and by 0.001 at δ = 6. The behaviour is a property of evaluating a presence-only model against constructed absences, not of this particular simulation.</w:t>
+      </w:r>
+    </w:p>
+    <w:p>
+      <w:r>
+        <w:rPr>
+          <w:b/>
+          <w:sz w:val="19"/>
+        </w:rPr>
+        <w:t>Table 2. Null-model AUC under varying simulation settings.</w:t>
+      </w:r>
+    </w:p>
+    <w:tbl>
+      <w:tblPr>
+        <w:tblStyle w:val="LightGrid-Accent1"/>
+        <w:tblW w:type="auto" w:w="0"/>
+        <w:jc w:val="center"/>
+        <w:tblLook w:firstColumn="1" w:firstRow="1" w:lastColumn="0" w:lastRow="0" w:noHBand="0" w:noVBand="1" w:val="04A0"/>
+      </w:tblPr>
+      <w:tblGrid>
+        <w:gridCol w:w="1234"/>
+        <w:gridCol w:w="1234"/>
+        <w:gridCol w:w="1234"/>
+        <w:gridCol w:w="1234"/>
+        <w:gridCol w:w="1234"/>
+        <w:gridCol w:w="1234"/>
+        <w:gridCol w:w="1234"/>
+      </w:tblGrid>
+      <w:tr>
+        <w:tc>
+          <w:tcPr>
+            <w:tcW w:type="dxa" w:w="3168"/>
+          </w:tcPr>
+          <w:p>
+            <w:r/>
+            <w:r>
+              <w:rPr>
+                <w:b/>
+                <w:sz w:val="18"/>
+              </w:rPr>
+              <w:t>Setting</w:t>
+            </w:r>
+          </w:p>
+        </w:tc>
+        <w:tc>
+          <w:tcPr>
+            <w:tcW w:type="dxa" w:w="893"/>
+          </w:tcPr>
+          <w:p>
+            <w:r/>
+            <w:r>
+              <w:rPr>
+                <w:b/>
+                <w:sz w:val="18"/>
+              </w:rPr>
+              <w:t>δ=0</w:t>
+            </w:r>
+          </w:p>
+        </w:tc>
+        <w:tc>
+          <w:tcPr>
+            <w:tcW w:type="dxa" w:w="893"/>
+          </w:tcPr>
+          <w:p>
+            <w:r/>
+            <w:r>
+              <w:rPr>
+                <w:b/>
+                <w:sz w:val="18"/>
+              </w:rPr>
+              <w:t>δ=1</w:t>
+            </w:r>
+          </w:p>
+        </w:tc>
+        <w:tc>
+          <w:tcPr>
+            <w:tcW w:type="dxa" w:w="893"/>
+          </w:tcPr>
+          <w:p>
+            <w:r/>
+            <w:r>
+              <w:rPr>
+                <w:b/>
+                <w:sz w:val="18"/>
+              </w:rPr>
+              <w:t>δ=2</w:t>
+            </w:r>
+          </w:p>
+        </w:tc>
+        <w:tc>
+          <w:tcPr>
+            <w:tcW w:type="dxa" w:w="893"/>
+          </w:tcPr>
+          <w:p>
+            <w:r/>
+            <w:r>
+              <w:rPr>
+                <w:b/>
+                <w:sz w:val="18"/>
+              </w:rPr>
+              <w:t>δ=3</w:t>
+            </w:r>
+          </w:p>
+        </w:tc>
+        <w:tc>
+          <w:tcPr>
+            <w:tcW w:type="dxa" w:w="893"/>
+          </w:tcPr>
+          <w:p>
+            <w:r/>
+            <w:r>
+              <w:rPr>
+                <w:b/>
+                <w:sz w:val="18"/>
+              </w:rPr>
+              <w:t>δ=4</w:t>
+            </w:r>
+          </w:p>
+        </w:tc>
+        <w:tc>
+          <w:tcPr>
+            <w:tcW w:type="dxa" w:w="893"/>
+          </w:tcPr>
+          <w:p>
+            <w:r/>
+            <w:r>
+              <w:rPr>
+                <w:b/>
+                <w:sz w:val="18"/>
+              </w:rPr>
+              <w:t>δ=6</w:t>
+            </w:r>
+          </w:p>
+        </w:tc>
+      </w:tr>
+      <w:tr>
+        <w:tc>
+          <w:tcPr>
+            <w:tcW w:type="dxa" w:w="3168"/>
+          </w:tcPr>
+          <w:p>
+            <w:r/>
+            <w:r>
+              <w:rPr>
+                <w:sz w:val="18"/>
+              </w:rPr>
+              <w:t>Random Forest, 20 predictors</w:t>
+            </w:r>
+          </w:p>
+        </w:tc>
+        <w:tc>
+          <w:tcPr>
+            <w:tcW w:type="dxa" w:w="893"/>
+          </w:tcPr>
+          <w:p>
+            <w:r/>
+            <w:r>
+              <w:rPr>
+                <w:sz w:val="18"/>
+              </w:rPr>
+              <w:t>0.500</w:t>
+            </w:r>
+          </w:p>
+        </w:tc>
+        <w:tc>
+          <w:tcPr>
+            <w:tcW w:type="dxa" w:w="893"/>
+          </w:tcPr>
+          <w:p>
+            <w:r/>
+            <w:r>
+              <w:rPr>
+                <w:sz w:val="18"/>
+              </w:rPr>
+              <w:t>0.739</w:t>
+            </w:r>
+          </w:p>
+        </w:tc>
+        <w:tc>
+          <w:tcPr>
+            <w:tcW w:type="dxa" w:w="893"/>
+          </w:tcPr>
+          <w:p>
+            <w:r/>
+            <w:r>
+              <w:rPr>
+                <w:sz w:val="18"/>
+              </w:rPr>
+              <w:t>0.913</w:t>
+            </w:r>
+          </w:p>
+        </w:tc>
+        <w:tc>
+          <w:tcPr>
+            <w:tcW w:type="dxa" w:w="893"/>
+          </w:tcPr>
+          <w:p>
+            <w:r/>
+            <w:r>
+              <w:rPr>
+                <w:sz w:val="18"/>
+              </w:rPr>
+              <w:t>0.979</w:t>
+            </w:r>
+          </w:p>
+        </w:tc>
+        <w:tc>
+          <w:tcPr>
+            <w:tcW w:type="dxa" w:w="893"/>
+          </w:tcPr>
+          <w:p>
+            <w:r/>
+            <w:r>
+              <w:rPr>
+                <w:sz w:val="18"/>
+              </w:rPr>
+              <w:t>0.995</w:t>
+            </w:r>
+          </w:p>
+        </w:tc>
+        <w:tc>
+          <w:tcPr>
+            <w:tcW w:type="dxa" w:w="893"/>
+          </w:tcPr>
+          <w:p>
+            <w:r/>
+            <w:r>
+              <w:rPr>
+                <w:sz w:val="18"/>
+              </w:rPr>
+              <w:t>1.000</w:t>
+            </w:r>
+          </w:p>
+        </w:tc>
+      </w:tr>
+      <w:tr>
+        <w:tc>
+          <w:tcPr>
+            <w:tcW w:type="dxa" w:w="3168"/>
+          </w:tcPr>
+          <w:p>
+            <w:r/>
+            <w:r>
+              <w:rPr>
+                <w:sz w:val="18"/>
+              </w:rPr>
+              <w:t>Random Forest, 4 predictors</w:t>
+            </w:r>
+          </w:p>
+        </w:tc>
+        <w:tc>
+          <w:tcPr>
+            <w:tcW w:type="dxa" w:w="893"/>
+          </w:tcPr>
+          <w:p>
+            <w:r/>
+            <w:r>
+              <w:rPr>
+                <w:sz w:val="18"/>
+              </w:rPr>
+              <w:t>0.489</w:t>
+            </w:r>
+          </w:p>
+        </w:tc>
+        <w:tc>
+          <w:tcPr>
+            <w:tcW w:type="dxa" w:w="893"/>
+          </w:tcPr>
+          <w:p>
+            <w:r/>
+            <w:r>
+              <w:rPr>
+                <w:sz w:val="18"/>
+              </w:rPr>
+              <w:t>0.730</w:t>
+            </w:r>
+          </w:p>
+        </w:tc>
+        <w:tc>
+          <w:tcPr>
+            <w:tcW w:type="dxa" w:w="893"/>
+          </w:tcPr>
+          <w:p>
+            <w:r/>
+            <w:r>
+              <w:rPr>
+                <w:sz w:val="18"/>
+              </w:rPr>
+              <w:t>0.910</w:t>
+            </w:r>
+          </w:p>
+        </w:tc>
+        <w:tc>
+          <w:tcPr>
+            <w:tcW w:type="dxa" w:w="893"/>
+          </w:tcPr>
+          <w:p>
+            <w:r/>
+            <w:r>
+              <w:rPr>
+                <w:sz w:val="18"/>
+              </w:rPr>
+              <w:t>0.979</w:t>
+            </w:r>
+          </w:p>
+        </w:tc>
+        <w:tc>
+          <w:tcPr>
+            <w:tcW w:type="dxa" w:w="893"/>
+          </w:tcPr>
+          <w:p>
+            <w:r/>
+            <w:r>
+              <w:rPr>
+                <w:sz w:val="18"/>
+              </w:rPr>
+              <w:t>0.996</w:t>
+            </w:r>
+          </w:p>
+        </w:tc>
+        <w:tc>
+          <w:tcPr>
+            <w:tcW w:type="dxa" w:w="893"/>
+          </w:tcPr>
+          <w:p>
+            <w:r/>
+            <w:r>
+              <w:rPr>
+                <w:sz w:val="18"/>
+              </w:rPr>
+              <w:t>1.000</w:t>
+            </w:r>
+          </w:p>
+        </w:tc>
+      </w:tr>
+      <w:tr>
+        <w:tc>
+          <w:tcPr>
+            <w:tcW w:type="dxa" w:w="3168"/>
+          </w:tcPr>
+          <w:p>
+            <w:r/>
+            <w:r>
+              <w:rPr>
+                <w:sz w:val="18"/>
+              </w:rPr>
+              <w:t>Random Forest, 8 predictors</w:t>
+            </w:r>
+          </w:p>
+        </w:tc>
+        <w:tc>
+          <w:tcPr>
+            <w:tcW w:type="dxa" w:w="893"/>
+          </w:tcPr>
+          <w:p>
+            <w:r/>
+            <w:r>
+              <w:rPr>
+                <w:sz w:val="18"/>
+              </w:rPr>
+              <w:t>0.494</w:t>
+            </w:r>
+          </w:p>
+        </w:tc>
+        <w:tc>
+          <w:tcPr>
+            <w:tcW w:type="dxa" w:w="893"/>
+          </w:tcPr>
+          <w:p>
+            <w:r/>
+            <w:r>
+              <w:rPr>
+                <w:sz w:val="18"/>
+              </w:rPr>
+              <w:t>0.748</w:t>
+            </w:r>
+          </w:p>
+        </w:tc>
+        <w:tc>
+          <w:tcPr>
+            <w:tcW w:type="dxa" w:w="893"/>
+          </w:tcPr>
+          <w:p>
+            <w:r/>
+            <w:r>
+              <w:rPr>
+                <w:sz w:val="18"/>
+              </w:rPr>
+              <w:t>0.915</w:t>
+            </w:r>
+          </w:p>
+        </w:tc>
+        <w:tc>
+          <w:tcPr>
+            <w:tcW w:type="dxa" w:w="893"/>
+          </w:tcPr>
+          <w:p>
+            <w:r/>
+            <w:r>
+              <w:rPr>
+                <w:sz w:val="18"/>
+              </w:rPr>
+              <w:t>0.976</w:t>
+            </w:r>
+          </w:p>
+        </w:tc>
+        <w:tc>
+          <w:tcPr>
+            <w:tcW w:type="dxa" w:w="893"/>
+          </w:tcPr>
+          <w:p>
+            <w:r/>
+            <w:r>
+              <w:rPr>
+                <w:sz w:val="18"/>
+              </w:rPr>
+              <w:t>0.994</w:t>
+            </w:r>
+          </w:p>
+        </w:tc>
+        <w:tc>
+          <w:tcPr>
+            <w:tcW w:type="dxa" w:w="893"/>
+          </w:tcPr>
+          <w:p>
+            <w:r/>
+            <w:r>
+              <w:rPr>
+                <w:sz w:val="18"/>
+              </w:rPr>
+              <w:t>1.000</w:t>
+            </w:r>
+          </w:p>
+        </w:tc>
+      </w:tr>
+      <w:tr>
+        <w:tc>
+          <w:tcPr>
+            <w:tcW w:type="dxa" w:w="3168"/>
+          </w:tcPr>
+          <w:p>
+            <w:r/>
+            <w:r>
+              <w:rPr>
+                <w:sz w:val="18"/>
+              </w:rPr>
+              <w:t>Random Forest, n=500 per class</w:t>
+            </w:r>
+          </w:p>
+        </w:tc>
+        <w:tc>
+          <w:tcPr>
+            <w:tcW w:type="dxa" w:w="893"/>
+          </w:tcPr>
+          <w:p>
+            <w:r/>
+            <w:r>
+              <w:rPr>
+                <w:sz w:val="18"/>
+              </w:rPr>
+              <w:t>0.484</w:t>
+            </w:r>
+          </w:p>
+        </w:tc>
+        <w:tc>
+          <w:tcPr>
+            <w:tcW w:type="dxa" w:w="893"/>
+          </w:tcPr>
+          <w:p>
+            <w:r/>
+            <w:r>
+              <w:rPr>
+                <w:sz w:val="18"/>
+              </w:rPr>
+              <w:t>0.718</w:t>
+            </w:r>
+          </w:p>
+        </w:tc>
+        <w:tc>
+          <w:tcPr>
+            <w:tcW w:type="dxa" w:w="893"/>
+          </w:tcPr>
+          <w:p>
+            <w:r/>
+            <w:r>
+              <w:rPr>
+                <w:sz w:val="18"/>
+              </w:rPr>
+              <w:t>0.901</w:t>
+            </w:r>
+          </w:p>
+        </w:tc>
+        <w:tc>
+          <w:tcPr>
+            <w:tcW w:type="dxa" w:w="893"/>
+          </w:tcPr>
+          <w:p>
+            <w:r/>
+            <w:r>
+              <w:rPr>
+                <w:sz w:val="18"/>
+              </w:rPr>
+              <w:t>0.971</w:t>
+            </w:r>
+          </w:p>
+        </w:tc>
+        <w:tc>
+          <w:tcPr>
+            <w:tcW w:type="dxa" w:w="893"/>
+          </w:tcPr>
+          <w:p>
+            <w:r/>
+            <w:r>
+              <w:rPr>
+                <w:sz w:val="18"/>
+              </w:rPr>
+              <w:t>0.992</w:t>
+            </w:r>
+          </w:p>
+        </w:tc>
+        <w:tc>
+          <w:tcPr>
+            <w:tcW w:type="dxa" w:w="893"/>
+          </w:tcPr>
+          <w:p>
+            <w:r/>
+            <w:r>
+              <w:rPr>
+                <w:sz w:val="18"/>
+              </w:rPr>
+              <w:t>0.999</w:t>
+            </w:r>
+          </w:p>
+        </w:tc>
+      </w:tr>
+      <w:tr>
+        <w:tc>
+          <w:tcPr>
+            <w:tcW w:type="dxa" w:w="3168"/>
+          </w:tcPr>
+          <w:p>
+            <w:r/>
+            <w:r>
+              <w:rPr>
+                <w:sz w:val="18"/>
+              </w:rPr>
+              <w:t>Random Forest, n=5000 per class</w:t>
+            </w:r>
+          </w:p>
+        </w:tc>
+        <w:tc>
+          <w:tcPr>
+            <w:tcW w:type="dxa" w:w="893"/>
+          </w:tcPr>
+          <w:p>
+            <w:r/>
+            <w:r>
+              <w:rPr>
+                <w:sz w:val="18"/>
+              </w:rPr>
+              <w:t>0.494</w:t>
+            </w:r>
+          </w:p>
+        </w:tc>
+        <w:tc>
+          <w:tcPr>
+            <w:tcW w:type="dxa" w:w="893"/>
+          </w:tcPr>
+          <w:p>
+            <w:r/>
+            <w:r>
+              <w:rPr>
+                <w:sz w:val="18"/>
+              </w:rPr>
+              <w:t>0.744</w:t>
+            </w:r>
+          </w:p>
+        </w:tc>
+        <w:tc>
+          <w:tcPr>
+            <w:tcW w:type="dxa" w:w="893"/>
+          </w:tcPr>
+          <w:p>
+            <w:r/>
+            <w:r>
+              <w:rPr>
+                <w:sz w:val="18"/>
+              </w:rPr>
+              <w:t>0.914</w:t>
+            </w:r>
+          </w:p>
+        </w:tc>
+        <w:tc>
+          <w:tcPr>
+            <w:tcW w:type="dxa" w:w="893"/>
+          </w:tcPr>
+          <w:p>
+            <w:r/>
+            <w:r>
+              <w:rPr>
+                <w:sz w:val="18"/>
+              </w:rPr>
+              <w:t>0.979</w:t>
+            </w:r>
+          </w:p>
+        </w:tc>
+        <w:tc>
+          <w:tcPr>
+            <w:tcW w:type="dxa" w:w="893"/>
+          </w:tcPr>
+          <w:p>
+            <w:r/>
+            <w:r>
+              <w:rPr>
+                <w:sz w:val="18"/>
+              </w:rPr>
+              <w:t>0.995</w:t>
+            </w:r>
+          </w:p>
+        </w:tc>
+        <w:tc>
+          <w:tcPr>
+            <w:tcW w:type="dxa" w:w="893"/>
+          </w:tcPr>
+          <w:p>
+            <w:r/>
+            <w:r>
+              <w:rPr>
+                <w:sz w:val="18"/>
+              </w:rPr>
+              <w:t>1.000</w:t>
+            </w:r>
+          </w:p>
+        </w:tc>
+      </w:tr>
+      <w:tr>
+        <w:tc>
+          <w:tcPr>
+            <w:tcW w:type="dxa" w:w="3168"/>
+          </w:tcPr>
+          <w:p>
+            <w:r/>
+            <w:r>
+              <w:rPr>
+                <w:sz w:val="18"/>
+              </w:rPr>
+              <w:t>XGBoost, 8 predictors</w:t>
+            </w:r>
+          </w:p>
+        </w:tc>
+        <w:tc>
+          <w:tcPr>
+            <w:tcW w:type="dxa" w:w="893"/>
+          </w:tcPr>
+          <w:p>
+            <w:r/>
+            <w:r>
+              <w:rPr>
+                <w:sz w:val="18"/>
+              </w:rPr>
+              <w:t>0.491</w:t>
+            </w:r>
+          </w:p>
+        </w:tc>
+        <w:tc>
+          <w:tcPr>
+            <w:tcW w:type="dxa" w:w="893"/>
+          </w:tcPr>
+          <w:p>
+            <w:r/>
+            <w:r>
+              <w:rPr>
+                <w:sz w:val="18"/>
+              </w:rPr>
+              <w:t>0.731</w:t>
+            </w:r>
+          </w:p>
+        </w:tc>
+        <w:tc>
+          <w:tcPr>
+            <w:tcW w:type="dxa" w:w="893"/>
+          </w:tcPr>
+          <w:p>
+            <w:r/>
+            <w:r>
+              <w:rPr>
+                <w:sz w:val="18"/>
+              </w:rPr>
+              <w:t>0.911</w:t>
+            </w:r>
+          </w:p>
+        </w:tc>
+        <w:tc>
+          <w:tcPr>
+            <w:tcW w:type="dxa" w:w="893"/>
+          </w:tcPr>
+          <w:p>
+            <w:r/>
+            <w:r>
+              <w:rPr>
+                <w:sz w:val="18"/>
+              </w:rPr>
+              <w:t>0.978</w:t>
+            </w:r>
+          </w:p>
+        </w:tc>
+        <w:tc>
+          <w:tcPr>
+            <w:tcW w:type="dxa" w:w="893"/>
+          </w:tcPr>
+          <w:p>
+            <w:r/>
+            <w:r>
+              <w:rPr>
+                <w:sz w:val="18"/>
+              </w:rPr>
+              <w:t>0.996</w:t>
+            </w:r>
+          </w:p>
+        </w:tc>
+        <w:tc>
+          <w:tcPr>
+            <w:tcW w:type="dxa" w:w="893"/>
+          </w:tcPr>
+          <w:p>
+            <w:r/>
+            <w:r>
+              <w:rPr>
+                <w:sz w:val="18"/>
+              </w:rPr>
+              <w:t>1.000</w:t>
+            </w:r>
+          </w:p>
+        </w:tc>
+      </w:tr>
+    </w:tbl>
+    <w:p/>
+    <w:p>
       <w:pPr>
         <w:pStyle w:val="Heading2"/>
       </w:pPr>
@@ -983,7 +1726,7 @@
           <w:b/>
           <w:sz w:val="19"/>
         </w:rPr>
-        <w:t>Table 2. Reported AUC and skill above the null model at the same absence design.</w:t>
+        <w:t>Table 3. Reported AUC and skill above the null model at the same absence design.</w:t>
       </w:r>
     </w:p>
     <w:tbl>
@@ -1390,7 +2133,7 @@
           <w:b/>
           <w:sz w:val="19"/>
         </w:rPr>
-        <w:t>Table 3. Cumulative effect of each methodological correction (XGBoost).</w:t>
+        <w:t>Table 4. Cumulative effect of each methodological correction (XGBoost).</w:t>
       </w:r>
     </w:p>
     <w:tbl>
@@ -1837,7 +2580,7 @@
           <w:b/>
           <w:sz w:val="19"/>
         </w:rPr>
-        <w:t>Table 4. Controlled decomposition of reported performance.</w:t>
+        <w:t>Table 5. Controlled decomposition of reported performance.</w:t>
       </w:r>
     </w:p>
     <w:tbl>
@@ -2296,7 +3039,7 @@
           <w:b/>
           <w:sz w:val="19"/>
         </w:rPr>
-        <w:t>Table 5. Sensitivity of the decomposition to inventory confidence.</w:t>
+        <w:t>Table 6. Sensitivity of the decomposition to inventory confidence.</w:t>
       </w:r>
     </w:p>
     <w:tbl>
@@ -2748,7 +3491,7 @@
           <w:b/>
           <w:sz w:val="19"/>
         </w:rPr>
-        <w:t>Table 6. Replacing coarse predictors with raw spatial coordinates.</w:t>
+        <w:t>Table 7. Replacing coarse predictors with raw spatial coordinates.</w:t>
       </w:r>
     </w:p>
     <w:tbl>
@@ -3195,7 +3938,7 @@
           <w:b/>
           <w:sz w:val="19"/>
         </w:rPr>
-        <w:t>Table 7. Effect of the background sampling ratio.</w:t>
+        <w:t>Table 8. Effect of the background sampling ratio.</w:t>
       </w:r>
     </w:p>
     <w:tbl>
@@ -3542,7 +4285,7 @@
           <w:b/>
           <w:sz w:val="19"/>
         </w:rPr>
-        <w:t>Table 8. Interventions tested on the corrected model (XGBoost, spatial-block CV).</w:t>
+        <w:t>Table 9. Interventions tested on the corrected model (XGBoost, spatial-block CV).</w:t>
       </w:r>
     </w:p>
     <w:tbl>

</xml_diff>

<commit_message>
State the counting rule once; show the inflation does not depend on displacement direction
The inventory counts exceed the table sample sizes at every recurrence threshold, not just at >= 4:
6,364 against 6,344 at >= 3, 3,188 against 3,179 at >= 4, 917 against 914 at >= 5, 241 against 240
at >= 6. A release point is dropped when any predictor is undefined at its cell. The rule is now
stated once in the methods and covers all four thresholds, replacing the single-threshold note.

Referee concern 3 asked whether displacing absences along one orthogonal axis is a special case.
Testing four alternatives - the same magnitude spread over five axes, along a random direction in
the uninformative subspace, and 30% along the informative axis itself, which is what an absence rule
favouring gentle terrain does - changes null-arm AUC by at most 0.016 at any displacement. The
inflation is a function of distance, not of direction.

Co-Authored-By: Claude Opus 5 <noreply@anthropic.com>
</commit_message>
<xml_diff>
--- a/Avalanche_Manuscript.docx
+++ b/Avalanche_Manuscript.docx
@@ -319,7 +319,16 @@
           <w:i w:val="0"/>
           <w:sz w:val="22"/>
         </w:rPr>
-        <w:t>Deposits are traced upslope to the highest pixel on release-angle terrain (30–50°) within a 600 m search radius, because susceptibility models predict release, not runout. This yields 6,364 candidate release points, of which 3,188 are flagged in four or more winters. Nine of those fall on cells where at least one predictor is undefined and are dropped, so 3,179 enter the analyses below; both figures are given wherever the inventory is described, since the difference is otherwise easy to mistake for an inconsistency. Occupied 10 km blocks cover 85% of the study area, so the inventory is not confined to road-accessible slopes.</w:t>
+        <w:t>Deposits are traced upslope to the highest pixel on release-angle terrain (30–50°) within a 600 m search radius, because susceptibility models predict release, not runout. This yields 6,364 candidate release points, of which 3,188 are flagged in four or more winters. Occupied 10 km blocks cover 85% of the study area, so the inventory is not confined to road-accessible slopes.</w:t>
+      </w:r>
+    </w:p>
+    <w:p>
+      <w:r>
+        <w:rPr>
+          <w:i w:val="0"/>
+          <w:sz w:val="22"/>
+        </w:rPr>
+        <w:t>One convention applies to every count reported below. A release point is discarded if any predictor is undefined at its cell, which happens at raster edges and on a small number of interior gaps. Inventory counts therefore exceed the sample sizes in the tables by a few points at each recurrence threshold: 6,364 detected against 6,344 analysed at recurrence ≥ 3, 3,188 against 3,179 at ≥ 4, 917 against 914 at ≥ 5, and 241 against 240 at ≥ 6. Figures quoted in the text are detections; figures in tables are the points that entered a model.</w:t>
       </w:r>
     </w:p>
     <w:p>
@@ -1730,6 +1739,53 @@
     </w:tbl>
     <w:p/>
     <w:p>
+      <w:r>
+        <w:rPr>
+          <w:i w:val="0"/>
+          <w:sz w:val="22"/>
+        </w:rPr>
+        <w:t>The construction displaces absences along a single axis chosen to carry no information about the outcome, which raises the question of whether that direction is special. It is not. Distributing the same displacement across five axes, along a random direction in the uninformative subspace, or partly along the informative axis itself — which is what an absence rule favouring gentle terrain actually does — changes the null-arm AUC by at most 0.016 at any displacement.</w:t>
+      </w:r>
+    </w:p>
+    <w:p>
+      <w:r>
+        <w:rPr>
+          <w:b/>
+          <w:sz w:val="19"/>
+        </w:rPr>
+        <w:t>Table 3. Null-model AUC under different displacement directions.</w:t>
+      </w:r>
+    </w:p>
+    <w:tbl>
+      <w:tblPr>
+        <w:tblStyle w:val="LightGrid-Accent1"/>
+        <w:tblW w:type="auto" w:w="0"/>
+        <w:jc w:val="center"/>
+        <w:tblLook w:firstColumn="1" w:firstRow="1" w:lastColumn="0" w:lastRow="0" w:noHBand="0" w:noVBand="1" w:val="04A0"/>
+      </w:tblPr>
+      <w:tblGrid>
+        <w:gridCol w:w="8640"/>
+      </w:tblGrid>
+      <w:tr>
+        <w:tc>
+          <w:tcPr>
+            <w:tcW w:type="dxa" w:w="2880"/>
+          </w:tcPr>
+          <w:p>
+            <w:r/>
+            <w:r>
+              <w:rPr>
+                <w:b/>
+                <w:sz w:val="18"/>
+              </w:rPr>
+              <w:t>Displacement direction</w:t>
+            </w:r>
+          </w:p>
+        </w:tc>
+      </w:tr>
+    </w:tbl>
+    <w:p/>
+    <w:p>
       <w:pPr>
         <w:pStyle w:val="Heading2"/>
       </w:pPr>
@@ -1755,7 +1811,7 @@
           <w:b/>
           <w:sz w:val="19"/>
         </w:rPr>
-        <w:t>Table 3. Recovery of known true skill by subtraction, against absence displacement.</w:t>
+        <w:t>Table 4. Recovery of known true skill by subtraction, against absence displacement.</w:t>
       </w:r>
     </w:p>
     <w:tbl>
@@ -2265,7 +2321,7 @@
           <w:b/>
           <w:sz w:val="19"/>
         </w:rPr>
-        <w:t>Table 4. Mean absolute error of the subtraction, by data structure and displacement.</w:t>
+        <w:t>Table 5. Mean absolute error of the subtraction, by data structure and displacement.</w:t>
       </w:r>
     </w:p>
     <w:tbl>
@@ -2787,7 +2843,7 @@
           <w:b/>
           <w:sz w:val="19"/>
         </w:rPr>
-        <w:t>Table 5. Absence separability, null baseline and remaining headroom for each configuration.</w:t>
+        <w:t>Table 6. Absence separability, null baseline and remaining headroom for each configuration.</w:t>
       </w:r>
     </w:p>
     <w:tbl>
@@ -3201,7 +3257,7 @@
           <w:b/>
           <w:sz w:val="19"/>
         </w:rPr>
-        <w:t>Table 6. Reported AUC under structured label contamination.</w:t>
+        <w:t>Table 7. Reported AUC under structured label contamination.</w:t>
       </w:r>
     </w:p>
     <w:tbl>
@@ -3782,7 +3838,7 @@
           <w:b/>
           <w:sz w:val="19"/>
         </w:rPr>
-        <w:t>Table 7. Cumulative effect of each methodological correction (XGBoost).</w:t>
+        <w:t>Table 8. Cumulative effect of each methodological correction (XGBoost).</w:t>
       </w:r>
     </w:p>
     <w:tbl>
@@ -4229,7 +4285,7 @@
           <w:b/>
           <w:sz w:val="19"/>
         </w:rPr>
-        <w:t>Table 8. Controlled decomposition of reported performance.</w:t>
+        <w:t>Table 9. Controlled decomposition of reported performance.</w:t>
       </w:r>
     </w:p>
     <w:tbl>
@@ -4688,7 +4744,7 @@
           <w:b/>
           <w:sz w:val="19"/>
         </w:rPr>
-        <w:t>Table 9. Sensitivity of the decomposition to inventory confidence.</w:t>
+        <w:t>Table 10. Sensitivity of the decomposition to inventory confidence.</w:t>
       </w:r>
     </w:p>
     <w:tbl>
@@ -5140,7 +5196,7 @@
           <w:b/>
           <w:sz w:val="19"/>
         </w:rPr>
-        <w:t>Table 10. Replacing coarse predictors with raw spatial coordinates.</w:t>
+        <w:t>Table 11. Replacing coarse predictors with raw spatial coordinates.</w:t>
       </w:r>
     </w:p>
     <w:tbl>
@@ -5587,7 +5643,7 @@
           <w:b/>
           <w:sz w:val="19"/>
         </w:rPr>
-        <w:t>Table 11. Effect of the background sampling ratio.</w:t>
+        <w:t>Table 12. Effect of the background sampling ratio.</w:t>
       </w:r>
     </w:p>
     <w:tbl>
@@ -5934,7 +5990,7 @@
           <w:b/>
           <w:sz w:val="19"/>
         </w:rPr>
-        <w:t>Table 12. Interventions tested on the corrected model (XGBoost, spatial-block CV).</w:t>
+        <w:t>Table 13. Interventions tested on the corrected model (XGBoost, spatial-block CV).</w:t>
       </w:r>
     </w:p>
     <w:tbl>

</xml_diff>

<commit_message>
Merge corrected manuscript back to the main filename
Co-Authored-By: Claude Opus 5 <noreply@anthropic.com>
</commit_message>
<xml_diff>
--- a/Avalanche_Manuscript.docx
+++ b/Avalanche_Manuscript.docx
@@ -1277,7 +1277,16 @@
           <w:i w:val="0"/>
           <w:sz w:val="22"/>
         </w:rPr>
-        <w:t>We therefore withdraw any proposal to correct a reported AUC, and state the limit instead: the absolute skill of a presence-only susceptibility model is not identifiable from the data it was fitted to. What remains identifiable is the RELATIVE effect of the absence design, obtained by holding the presences, the predictors and the model fixed and varying only how absences are drawn. That comparison is the subject of the remaining sections, and it is available to any study at the cost of running its own pipeline a second time.</w:t>
+        <w:t>Two failed constructions do not establish that every conceivable null must fail, and we do not claim a general impossibility theorem. What the two-world construction establishes is sharper and sufficient: under the observational setup a presence-only study actually has — the presence sample, the absence sample, and the predictors — two models whose true skill differs by 0.281 can produce data a study could not tell apart. Any correction must therefore import information from outside that setup, such as verified true absences or a second independently designed absence set. Stating the null hypothesis precisely matters here: we test the hypothesis that predictors carry no information about occurrence beyond what the sampling design induces, which is not the same as testing for no association after conditioning on spatial structure.</w:t>
+      </w:r>
+    </w:p>
+    <w:p>
+      <w:r>
+        <w:rPr>
+          <w:i w:val="0"/>
+          <w:sz w:val="22"/>
+        </w:rPr>
+        <w:t>We therefore withdraw our proposal to correct a reported AUC, and state the limit instead: the absolute skill of a presence-only susceptibility model is not recoverable from the data it was fitted to alone. What remains identifiable is the RELATIVE effect of the absence design, obtained by holding the presences, the predictors and the model fixed and varying only how absences are drawn. That comparison is the subject of the remaining sections, and it is available to any study at the cost of running its own pipeline a second time.</w:t>
       </w:r>
     </w:p>
     <w:p>
@@ -2359,7 +2368,7 @@
           <w:i w:val="0"/>
           <w:sz w:val="22"/>
         </w:rPr>
-        <w:t>Two configurations recur below and must not be confused. CONFIGURATION C2 applies the melt-out filter and centroid-derived release points to the single-scale predictor set, and reaches AUC 0.841. CONFIGURATION C3 adds the multi-scale terrain predictors of Section 4.7 to C2 and reaches 0.866. The correction ladder in Table 5 ends at C2, because its purpose is to isolate the cost of each correction with the predictor set held fixed; the design-adjusted figures in Section 4.2 use C3, the best-performing honest configuration. Both are reported throughout rather than silently interchanged.</w:t>
+        <w:t>Two configurations recur below and must not be confused. CONFIGURATION C2 applies the melt-out filter and centroid-derived release points to the single-scale predictor set, and reaches AUC 0.841. CONFIGURATION C3 adds the multi-scale terrain predictors of Section 4.7 to C2 and reaches 0.866. The correction ladder ends at C2, because its purpose is to isolate the cost of each correction with the predictor set held fixed; C3 is the best-performing honest configuration and is the one quoted wherever a single current figure is needed. Both are reported throughout rather than silently interchanged.</w:t>
       </w:r>
     </w:p>
     <w:p>
@@ -4945,7 +4954,7 @@
           <w:i w:val="0"/>
           <w:sz w:val="22"/>
         </w:rPr>
-        <w:t>Susceptibility data are presence-only: the locations of past events are observed, and the absences are constructed by the analyst. Section 4.1 shows that this construction, not the model, sets most of the reported score — a model with no skill at all reaches 0.910 at two standard deviations of absence displacement and 1.000 at six. Two consequences follow, and neither is specific to avalanches.</w:t>
+        <w:t>Susceptibility data are presence-only: the locations of past events are observed, and the absences are constructed by the analyst. Section 4.1 shows that this construction, not the model, sets most of the reported score — a model with no skill at all reaches 0.910 at two standard deviations of absence displacement and 1.000 at six. Section 4.2 shows that the contribution cannot be removed after the fact. Three consequences follow, and none is specific to avalanches.</w:t>
       </w:r>
     </w:p>
     <w:p>
@@ -4954,7 +4963,7 @@
           <w:i w:val="0"/>
           <w:sz w:val="22"/>
         </w:rPr>
-        <w:t>First, AUC is not comparable between studies that drew their absences differently. A study reporting 0.97 with absences taken from flat farmland has not demonstrated more skill than one reporting 0.85 with absences on comparable terrain; on the evidence here it has probably demonstrated less. Model comparisons, predictor rankings and claims of improvement over prior work all inherit this, because all of them rest on a quantity that the sampling design has already largely determined.</w:t>
+        <w:t>First, AUC is not comparable between studies that drew their absences differently. A study reporting 0.97 with absences taken from flat farmland has not demonstrated more skill than one reporting 0.85 with absences on comparable terrain. Model comparisons, predictor rankings and claims of improvement over prior work all inherit this, because all rest on a quantity the sampling design has already largely determined.</w:t>
       </w:r>
     </w:p>
     <w:p>
@@ -4963,7 +4972,16 @@
           <w:i w:val="0"/>
           <w:sz w:val="22"/>
         </w:rPr>
-        <w:t>Second, above roughly three standard deviations of separation the measure saturates and stops discriminating at all: in the simulation a model with genuine skill and a model with none both report values above 0.97. Much of the published literature appears to operate in that regime. The practical recommendation is not that existing maps be discarded — a map can be useful without its headline statistic being meaningful — but that absence selection be reported and justified as carefully as model selection currently is, and that the two quantities introduced here be reported alongside AUC.</w:t>
+        <w:t>Second, above roughly three standard deviations of separation the measure saturates and stops discriminating: in the simulation a model with genuine skill and a model with none both report values above 0.97. Much of the published literature appears to operate in that regime.</w:t>
+      </w:r>
+    </w:p>
+    <w:p>
+      <w:r>
+        <w:rPr>
+          <w:i w:val="0"/>
+          <w:sz w:val="22"/>
+        </w:rPr>
+        <w:t>Third — and this is the limit that bites — the part of a reported AUC attributable to the model cannot be recovered by arithmetic. A difference between the presence and absence samples enters the statistic identically whether it arises from genuine terrain differences or from where the absences were drawn, and the samples are all the evidence there is. Any correction, including the one we attempted, requires assumptions that the data cannot supply.</w:t>
       </w:r>
     </w:p>
     <w:p>
@@ -4974,7 +4992,7 @@
         <w:rPr>
           <w:color w:val="0B3D5C"/>
         </w:rPr>
-        <w:t>5.2 A correction that studies can apply to themselves</w:t>
+        <w:t>5.2 A design-sensitivity diagnostic rather than an AUC correction</w:t>
       </w:r>
     </w:p>
     <w:p>
@@ -4983,7 +5001,7 @@
           <w:i w:val="0"/>
           <w:sz w:val="22"/>
         </w:rPr>
-        <w:t>Both quantities are cheap to compute. The separability δ is a standardised distance between the presence and absence clouds in predictor space and requires only the study's own training table. The null baseline is a simulation at that δ, which takes seconds. Their difference — the skill a model contributes above what its sampling design already delivers — is the number a reader assumes AUC reports. Code for both is released with this paper.</w:t>
+        <w:t>What a study can do instead is measure how much its own reported figure depends on a choice it made. Holding the presences, the predictors, the model and the evaluation protocol fixed, and varying only how absences are drawn, isolates the contribution of the sampling design. The result is not a corrected accuracy and should not be reported as one: it is a sensitivity, analogous to reporting how a result moves under a plausible alternative specification.</w:t>
       </w:r>
     </w:p>
     <w:p>
@@ -4992,7 +5010,16 @@
           <w:i w:val="0"/>
           <w:sz w:val="22"/>
         </w:rPr>
-        <w:t>The correction is deliberately conservative. It does not claim to recover a model's true accuracy, only to remove a component of the reported score that is attributable to the experimental design rather than to the model. Where a design is so separable that a null model already scores 1.000, the correction returns zero and the honest conclusion is that the study has not measured predictive skill at all.</w:t>
+        <w:t>Concretely, we suggest four things. Report the absence rule explicitly, in enough detail that it could be reimplemented. Run the same pipeline under at least two defensible absence designs and report the range of AUC obtained. Where an independent evaluation set can be constructed whose absences are drawn like the presences, report performance against it, since that figure is interpretable in a way the in-sample one is not. And treat a large spread across designs as what it is — evidence that the headline number describes the experiment rather than the model.</w:t>
+      </w:r>
+    </w:p>
+    <w:p>
+      <w:r>
+        <w:rPr>
+          <w:i w:val="0"/>
+          <w:sz w:val="22"/>
+        </w:rPr>
+        <w:t>On the data used here that spread is 0.031 across four absence designs, from 0.923 with absences matched on slope to 0.954 with absences drawn at random from the candidate pool, which is the common default. That range is wider than the differences typically reported between competing models in this literature. The comparison requires no new statistic and no simulation; it is one extra run of a pipeline a study has already built, and designcheck.py in the repository performs it on any presence-only dataset.</w:t>
       </w:r>
     </w:p>
     <w:p>
@@ -5040,7 +5067,7 @@
         <w:pStyle w:val="ListBullet"/>
       </w:pPr>
       <w:r>
-        <w:t>The simulation establishes that absence displacement inflates AUC and provides a baseline at a given separability. It does not model every way a real absence design can differ from the presences — spatial clustering, differing covariance structure and non-Gaussian predictor distributions are all simplified — so the baseline should be read as an approximation rather than an exact correction.</w:t>
+        <w:t>The simulation establishes that absence displacement inflates AUC and characterises how the inflation behaves. It is not a calibration: Section 4.2 withdraws the proposal to read a baseline off it and subtract that from a real study's figure, and the simulated values should not be used that way. The construction also simplifies real predictor structure — spatial clustering, covariance and non-Gaussian marginals are all idealised — though the invariance checks in the supplementary material show the qualitative behaviour survives each of these.</w:t>
       </w:r>
     </w:p>
     <w:p>
@@ -5099,7 +5126,7 @@
         <w:pStyle w:val="ListBullet"/>
       </w:pPr>
       <w:r>
-        <w:t>Measured on that scale, a published avalanche susceptibility protocol places its absences 7.06 standard deviations from its presences, where a null model is predicted to score 1.000. Run on an independent inventory, the protocol returns 1.000.</w:t>
+        <w:t>A published avalanche susceptibility protocol places its absences 7.06 standard deviations from its presences on the diagonal measure, in a regime where the SIMULATION returns 1.000 for a model with no skill. Run on an independent inventory, the protocol OBSERVES 1.000. The agreement is informative but the two figures are different kinds of quantity, and the simulated one is not an estimate of the real model's skill.</w:t>
       </w:r>
     </w:p>
     <w:p>

</xml_diff>